<commit_message>
Add cleaning/disinfection sheets for middle, senior and preparatory groups; fix linen column label
Co-Authored-By: Claude Opus 5.5 <noreply@anthropic.com>
Claude-Session: https://claude.ai/code/session_01RvXsjmA1DL5HHfNuUnQMYY
</commit_message>
<xml_diff>
--- a/Эрүүл_мэнд_хүүхэд_хамгаалал/Нэгдсэн/1_Tseverlegee_ariutgal.docx
+++ b/Эрүүл_мэнд_хүүхэд_хамгаалал/Нэгдсэн/1_Tseverlegee_ariutgal.docx
@@ -2720,9 +2720,7 @@
                 <w:b/>
                 <w:sz w:val="15"/>
               </w:rPr>
-              <w:t>Хоолны</w:t>
-              <w:br/>
-              <w:t>смоцок /</w:t>
+              <w:t>Хормогч,</w:t>
               <w:br/>
               <w:t>бусад</w:t>
             </w:r>

</xml_diff>